<commit_message>
ARK-445: RESULTS report (VERDICT=FAIL) + finalize RUN_LOG steps 8-11. Tri-state discrimination strong (S_A_min=0.9626, HOLD=[0.492,0.495], Delta_H=0.463); single failing criterion arm9 reset-based confusion/replay 0.0289 > 0.02 DENY ceiling. No post-data rescue.
</commit_message>
<xml_diff>
--- a/ark-445/RUN_LOG.docx
+++ b/ark-445/RUN_LOG.docx
@@ -2,7 +2,7 @@
 <file path=word/document.xml><?xml version="1.0" encoding="utf-8"?>
 <w:document xmlns:w="http://schemas.openxmlformats.org/wordprocessingml/2006/main" xmlns:m="http://schemas.openxmlformats.org/officeDocument/2006/math" xmlns:r="http://schemas.openxmlformats.org/officeDocument/2006/relationships" xmlns:o="urn:schemas-microsoft-com:office:office" xmlns:v="urn:schemas-microsoft-com:vml" xmlns:w10="urn:schemas-microsoft-com:office:word" xmlns:a="http://schemas.openxmlformats.org/drawingml/2006/main" xmlns:pic="http://schemas.openxmlformats.org/drawingml/2006/picture" xmlns:wp="http://schemas.openxmlformats.org/drawingml/2006/wordprocessingDrawing">
   <w:body>
-    <w:bookmarkStart w:id="24" w:name="ark-445-run-log"/>
+    <w:bookmarkStart w:id="25" w:name="ark-445-run-log"/>
     <w:p>
       <w:pPr>
         <w:pStyle w:val="Heading1"/>
@@ -263,20 +263,86 @@
       </w:pPr>
       <w:r>
         <w:rPr>
-          <w:iCs/>
-          <w:i/>
-        </w:rPr>
-        <w:t xml:space="preserve">(pending)</w:t>
+          <w:bCs/>
+          <w:b/>
+        </w:rPr>
+        <w:t xml:space="preserve">Committed BEFORE any job.</w:t>
+      </w:r>
+      <w:r>
+        <w:t xml:space="preserve"> </w:t>
+      </w:r>
+      <w:r>
+        <w:t xml:space="preserve">Q_A=2 (RE=0.0032), Q_P=1 (RE=0.0022), connected, sum_RE=0.0054.</w:t>
+      </w:r>
+    </w:p>
+    <w:p>
+      <w:pPr>
+        <w:numPr>
+          <w:ilvl w:val="0"/>
+          <w:numId w:val="1003"/>
+        </w:numPr>
+        <w:pStyle w:val="Compact"/>
+      </w:pPr>
+      <w:r>
+        <w:rPr>
+          <w:bCs/>
+          <w:b/>
+        </w:rPr>
+        <w:t xml:space="preserve">Rule:</w:t>
+      </w:r>
+      <w:r>
+        <w:t xml:space="preserve"> </w:t>
+      </w:r>
+      <w:r>
+        <w:t xml:space="preserve">2 connected qubits, RE(Q_A) &lt; 0.02, RE(Q_P) &lt; 0.02, argmin(RE_A + RE_P); lower-RE qubit assigned Q_P (payload/PRIMARY).</w:t>
+      </w:r>
+    </w:p>
+    <w:p>
+      <w:pPr>
+        <w:numPr>
+          <w:ilvl w:val="0"/>
+          <w:numId w:val="1003"/>
+        </w:numPr>
+        <w:pStyle w:val="Compact"/>
+      </w:pPr>
+      <w:r>
+        <w:rPr>
+          <w:bCs/>
+          <w:b/>
+        </w:rPr>
+        <w:t xml:space="preserve">Selection timestamp (UTC):</w:t>
+      </w:r>
+      <w:r>
+        <w:t xml:space="preserve"> </w:t>
+      </w:r>
+      <w:r>
+        <w:t xml:space="preserve">2026-07-17T01:34:14.221759+00:00</w:t>
+      </w:r>
+    </w:p>
+    <w:p>
+      <w:pPr>
+        <w:numPr>
+          <w:ilvl w:val="0"/>
+          <w:numId w:val="1003"/>
+        </w:numPr>
+        <w:pStyle w:val="Compact"/>
+      </w:pPr>
+      <w:r>
+        <w:rPr>
+          <w:bCs/>
+          <w:b/>
+        </w:rPr>
+        <w:t xml:space="preserve">initial_layout=[Q_A, Q_P]=[2, 1]</w:t>
       </w:r>
     </w:p>
     <w:bookmarkEnd w:id="21"/>
-    <w:bookmarkStart w:id="22" w:name="step-3-4-spam-kill-gate"/>
+    <w:bookmarkStart w:id="22" w:name="X67d7713ebc76346907ad66f6d67d5c57513cdf3"/>
     <w:p>
       <w:pPr>
         <w:pStyle w:val="Heading2"/>
       </w:pPr>
       <w:r>
-        <w:t xml:space="preserve">Step 3-4 — SPAM kill-gate</w:t>
+        <w:t xml:space="preserve">Step 3-4 — SPAM kill-gate (committed BEFORE principal job)</w:t>
       </w:r>
     </w:p>
     <w:p>
@@ -289,20 +355,117 @@
       </w:pPr>
       <w:r>
         <w:rPr>
-          <w:iCs/>
-          <w:i/>
-        </w:rPr>
-        <w:t xml:space="preserve">(pending)</w:t>
+          <w:bCs/>
+          <w:b/>
+        </w:rPr>
+        <w:t xml:space="preserve">SPAM job id:</w:t>
+      </w:r>
+      <w:r>
+        <w:t xml:space="preserve"> </w:t>
+      </w:r>
+      <w:r>
+        <w:rPr>
+          <w:rStyle w:val="VerbatimChar"/>
+        </w:rPr>
+        <w:t xml:space="preserve">d9coda9htsac739c1djg</w:t>
+      </w:r>
+    </w:p>
+    <w:p>
+      <w:pPr>
+        <w:numPr>
+          <w:ilvl w:val="0"/>
+          <w:numId w:val="1004"/>
+        </w:numPr>
+        <w:pStyle w:val="Compact"/>
+      </w:pPr>
+      <w:r>
+        <w:rPr>
+          <w:bCs/>
+          <w:b/>
+        </w:rPr>
+        <w:t xml:space="preserve">SPAM_A (Q_A idle):</w:t>
+      </w:r>
+      <w:r>
+        <w:t xml:space="preserve"> </w:t>
+      </w:r>
+      <w:r>
+        <w:t xml:space="preserve">0.0007 (ceiling 0.02) — PASS</w:t>
+      </w:r>
+    </w:p>
+    <w:p>
+      <w:pPr>
+        <w:numPr>
+          <w:ilvl w:val="0"/>
+          <w:numId w:val="1004"/>
+        </w:numPr>
+        <w:pStyle w:val="Compact"/>
+      </w:pPr>
+      <w:r>
+        <w:rPr>
+          <w:bCs/>
+          <w:b/>
+        </w:rPr>
+        <w:t xml:space="preserve">SPAM_P (Q_P idle):</w:t>
+      </w:r>
+      <w:r>
+        <w:t xml:space="preserve"> </w:t>
+      </w:r>
+      <w:r>
+        <w:t xml:space="preserve">0.0011 (ceiling 0.02) — PASS</w:t>
+      </w:r>
+    </w:p>
+    <w:p>
+      <w:pPr>
+        <w:numPr>
+          <w:ilvl w:val="0"/>
+          <w:numId w:val="1004"/>
+        </w:numPr>
+        <w:pStyle w:val="Compact"/>
+      </w:pPr>
+      <w:r>
+        <w:rPr>
+          <w:bCs/>
+          <w:b/>
+        </w:rPr>
+        <w:t xml:space="preserve">SPAM_drift:</w:t>
+      </w:r>
+      <w:r>
+        <w:t xml:space="preserve"> </w:t>
+      </w:r>
+      <w:r>
+        <w:t xml:space="preserve">0.0004 (ceiling 0.005) — OK</w:t>
+      </w:r>
+    </w:p>
+    <w:p>
+      <w:pPr>
+        <w:numPr>
+          <w:ilvl w:val="0"/>
+          <w:numId w:val="1004"/>
+        </w:numPr>
+        <w:pStyle w:val="Compact"/>
+      </w:pPr>
+      <w:r>
+        <w:rPr>
+          <w:bCs/>
+          <w:b/>
+        </w:rPr>
+        <w:t xml:space="preserve">Gate:</w:t>
+      </w:r>
+      <w:r>
+        <w:t xml:space="preserve"> </w:t>
+      </w:r>
+      <w:r>
+        <w:t xml:space="preserve">PASSED. Principal job authorized to proceed.</w:t>
       </w:r>
     </w:p>
     <w:bookmarkEnd w:id="22"/>
-    <w:bookmarkStart w:id="23" w:name="step-6-7-principal-job"/>
+    <w:bookmarkStart w:id="23" w:name="principal-9-arm-job"/>
     <w:p>
       <w:pPr>
         <w:pStyle w:val="Heading2"/>
       </w:pPr>
       <w:r>
-        <w:t xml:space="preserve">Step 6-7 — Principal job</w:t>
+        <w:t xml:space="preserve">Principal 9-arm job</w:t>
       </w:r>
     </w:p>
     <w:p>
@@ -311,18 +474,1307 @@
           <w:ilvl w:val="0"/>
           <w:numId w:val="1005"/>
         </w:numPr>
+      </w:pPr>
+      <w:r>
+        <w:rPr>
+          <w:bCs/>
+          <w:b/>
+        </w:rPr>
+        <w:t xml:space="preserve">Backend:</w:t>
+      </w:r>
+      <w:r>
+        <w:t xml:space="preserve"> </w:t>
+      </w:r>
+      <w:r>
+        <w:t xml:space="preserve">ibm_marrakesh</w:t>
+      </w:r>
+    </w:p>
+    <w:p>
+      <w:pPr>
+        <w:numPr>
+          <w:ilvl w:val="0"/>
+          <w:numId w:val="1005"/>
+        </w:numPr>
+      </w:pPr>
+      <w:r>
+        <w:rPr>
+          <w:bCs/>
+          <w:b/>
+        </w:rPr>
+        <w:t xml:space="preserve">Instance:</w:t>
+      </w:r>
+      <w:r>
+        <w:t xml:space="preserve"> </w:t>
+      </w:r>
+      <w:r>
+        <w:t xml:space="preserve">open-instance</w:t>
+      </w:r>
+    </w:p>
+    <w:p>
+      <w:pPr>
+        <w:numPr>
+          <w:ilvl w:val="0"/>
+          <w:numId w:val="1005"/>
+        </w:numPr>
+      </w:pPr>
+      <w:r>
+        <w:rPr>
+          <w:bCs/>
+          <w:b/>
+        </w:rPr>
+        <w:t xml:space="preserve">Physical qubits [Q_A, Q_P]:</w:t>
+      </w:r>
+      <w:r>
+        <w:t xml:space="preserve"> </w:t>
+      </w:r>
+      <w:r>
+        <w:t xml:space="preserve">[2, 1]</w:t>
+      </w:r>
+    </w:p>
+    <w:p>
+      <w:pPr>
+        <w:numPr>
+          <w:ilvl w:val="0"/>
+          <w:numId w:val="1005"/>
+        </w:numPr>
+      </w:pPr>
+      <w:r>
+        <w:rPr>
+          <w:bCs/>
+          <w:b/>
+        </w:rPr>
+        <w:t xml:space="preserve">Shots per arm:</w:t>
+      </w:r>
+      <w:r>
+        <w:t xml:space="preserve"> </w:t>
+      </w:r>
+      <w:r>
+        <w:t xml:space="preserve">8192</w:t>
+      </w:r>
+    </w:p>
+    <w:p>
+      <w:pPr>
+        <w:numPr>
+          <w:ilvl w:val="0"/>
+          <w:numId w:val="1005"/>
+        </w:numPr>
+      </w:pPr>
+      <w:r>
+        <w:rPr>
+          <w:bCs/>
+          <w:b/>
+        </w:rPr>
+        <w:t xml:space="preserve">Arms:</w:t>
+      </w:r>
+      <w:r>
+        <w:t xml:space="preserve"> </w:t>
+      </w:r>
+      <w:r>
+        <w:t xml:space="preserve">9 (arm1_allow_standard, arm2_deny_standard, arm3_hold_plus, arm4_hold_minus, arm5_allow_alt, arm6_deny_alt, arm7_allow_reverified, arm8_deny_expired, arm9_confusion_replay)</w:t>
+      </w:r>
+    </w:p>
+    <w:p>
+      <w:pPr>
+        <w:numPr>
+          <w:ilvl w:val="0"/>
+          <w:numId w:val="1005"/>
+        </w:numPr>
+      </w:pPr>
+      <w:r>
+        <w:rPr>
+          <w:bCs/>
+          <w:b/>
+        </w:rPr>
+        <w:t xml:space="preserve">Arm expectations:</w:t>
+      </w:r>
+      <w:r>
+        <w:t xml:space="preserve"> </w:t>
+      </w:r>
+      <w:r>
+        <w:t xml:space="preserve">{</w:t>
+      </w:r>
+      <w:r>
+        <w:t xml:space="preserve">‘</w:t>
+      </w:r>
+      <w:r>
+        <w:t xml:space="preserve">arm1_allow_standard</w:t>
+      </w:r>
+      <w:r>
+        <w:t xml:space="preserve">’</w:t>
+      </w:r>
+      <w:r>
+        <w:t xml:space="preserve">:</w:t>
+      </w:r>
+      <w:r>
+        <w:t xml:space="preserve"> </w:t>
+      </w:r>
+      <w:r>
+        <w:t xml:space="preserve">‘</w:t>
+      </w:r>
+      <w:r>
+        <w:t xml:space="preserve">ALLOW</w:t>
+      </w:r>
+      <w:r>
+        <w:t xml:space="preserve">’</w:t>
+      </w:r>
+      <w:r>
+        <w:t xml:space="preserve">,</w:t>
+      </w:r>
+      <w:r>
+        <w:t xml:space="preserve"> </w:t>
+      </w:r>
+      <w:r>
+        <w:t xml:space="preserve">‘</w:t>
+      </w:r>
+      <w:r>
+        <w:t xml:space="preserve">arm2_deny_standard</w:t>
+      </w:r>
+      <w:r>
+        <w:t xml:space="preserve">’</w:t>
+      </w:r>
+      <w:r>
+        <w:t xml:space="preserve">:</w:t>
+      </w:r>
+      <w:r>
+        <w:t xml:space="preserve"> </w:t>
+      </w:r>
+      <w:r>
+        <w:t xml:space="preserve">‘</w:t>
+      </w:r>
+      <w:r>
+        <w:t xml:space="preserve">DENY</w:t>
+      </w:r>
+      <w:r>
+        <w:t xml:space="preserve">’</w:t>
+      </w:r>
+      <w:r>
+        <w:t xml:space="preserve">,</w:t>
+      </w:r>
+      <w:r>
+        <w:t xml:space="preserve"> </w:t>
+      </w:r>
+      <w:r>
+        <w:t xml:space="preserve">‘</w:t>
+      </w:r>
+      <w:r>
+        <w:t xml:space="preserve">arm3_hold_plus</w:t>
+      </w:r>
+      <w:r>
+        <w:t xml:space="preserve">’</w:t>
+      </w:r>
+      <w:r>
+        <w:t xml:space="preserve">:</w:t>
+      </w:r>
+      <w:r>
+        <w:t xml:space="preserve"> </w:t>
+      </w:r>
+      <w:r>
+        <w:t xml:space="preserve">‘</w:t>
+      </w:r>
+      <w:r>
+        <w:t xml:space="preserve">HOLD</w:t>
+      </w:r>
+      <w:r>
+        <w:t xml:space="preserve">’</w:t>
+      </w:r>
+      <w:r>
+        <w:t xml:space="preserve">,</w:t>
+      </w:r>
+      <w:r>
+        <w:t xml:space="preserve"> </w:t>
+      </w:r>
+      <w:r>
+        <w:t xml:space="preserve">‘</w:t>
+      </w:r>
+      <w:r>
+        <w:t xml:space="preserve">arm4_hold_minus</w:t>
+      </w:r>
+      <w:r>
+        <w:t xml:space="preserve">’</w:t>
+      </w:r>
+      <w:r>
+        <w:t xml:space="preserve">:</w:t>
+      </w:r>
+      <w:r>
+        <w:t xml:space="preserve"> </w:t>
+      </w:r>
+      <w:r>
+        <w:t xml:space="preserve">‘</w:t>
+      </w:r>
+      <w:r>
+        <w:t xml:space="preserve">HOLD</w:t>
+      </w:r>
+      <w:r>
+        <w:t xml:space="preserve">’</w:t>
+      </w:r>
+      <w:r>
+        <w:t xml:space="preserve">,</w:t>
+      </w:r>
+      <w:r>
+        <w:t xml:space="preserve"> </w:t>
+      </w:r>
+      <w:r>
+        <w:t xml:space="preserve">‘</w:t>
+      </w:r>
+      <w:r>
+        <w:t xml:space="preserve">arm5_allow_alt</w:t>
+      </w:r>
+      <w:r>
+        <w:t xml:space="preserve">’</w:t>
+      </w:r>
+      <w:r>
+        <w:t xml:space="preserve">:</w:t>
+      </w:r>
+      <w:r>
+        <w:t xml:space="preserve"> </w:t>
+      </w:r>
+      <w:r>
+        <w:t xml:space="preserve">‘</w:t>
+      </w:r>
+      <w:r>
+        <w:t xml:space="preserve">ALLOW</w:t>
+      </w:r>
+      <w:r>
+        <w:t xml:space="preserve">’</w:t>
+      </w:r>
+      <w:r>
+        <w:t xml:space="preserve">,</w:t>
+      </w:r>
+      <w:r>
+        <w:t xml:space="preserve"> </w:t>
+      </w:r>
+      <w:r>
+        <w:t xml:space="preserve">‘</w:t>
+      </w:r>
+      <w:r>
+        <w:t xml:space="preserve">arm6_deny_alt</w:t>
+      </w:r>
+      <w:r>
+        <w:t xml:space="preserve">’</w:t>
+      </w:r>
+      <w:r>
+        <w:t xml:space="preserve">:</w:t>
+      </w:r>
+      <w:r>
+        <w:t xml:space="preserve"> </w:t>
+      </w:r>
+      <w:r>
+        <w:t xml:space="preserve">‘</w:t>
+      </w:r>
+      <w:r>
+        <w:t xml:space="preserve">DENY</w:t>
+      </w:r>
+      <w:r>
+        <w:t xml:space="preserve">’</w:t>
+      </w:r>
+      <w:r>
+        <w:t xml:space="preserve">,</w:t>
+      </w:r>
+      <w:r>
+        <w:t xml:space="preserve"> </w:t>
+      </w:r>
+      <w:r>
+        <w:t xml:space="preserve">‘</w:t>
+      </w:r>
+      <w:r>
+        <w:t xml:space="preserve">arm7_allow_reverified</w:t>
+      </w:r>
+      <w:r>
+        <w:t xml:space="preserve">’</w:t>
+      </w:r>
+      <w:r>
+        <w:t xml:space="preserve">:</w:t>
+      </w:r>
+      <w:r>
+        <w:t xml:space="preserve"> </w:t>
+      </w:r>
+      <w:r>
+        <w:t xml:space="preserve">‘</w:t>
+      </w:r>
+      <w:r>
+        <w:t xml:space="preserve">ALLOW</w:t>
+      </w:r>
+      <w:r>
+        <w:t xml:space="preserve">’</w:t>
+      </w:r>
+      <w:r>
+        <w:t xml:space="preserve">,</w:t>
+      </w:r>
+      <w:r>
+        <w:t xml:space="preserve"> </w:t>
+      </w:r>
+      <w:r>
+        <w:t xml:space="preserve">‘</w:t>
+      </w:r>
+      <w:r>
+        <w:t xml:space="preserve">arm8_deny_expired</w:t>
+      </w:r>
+      <w:r>
+        <w:t xml:space="preserve">’</w:t>
+      </w:r>
+      <w:r>
+        <w:t xml:space="preserve">:</w:t>
+      </w:r>
+      <w:r>
+        <w:t xml:space="preserve"> </w:t>
+      </w:r>
+      <w:r>
+        <w:t xml:space="preserve">‘</w:t>
+      </w:r>
+      <w:r>
+        <w:t xml:space="preserve">DENY</w:t>
+      </w:r>
+      <w:r>
+        <w:t xml:space="preserve">’</w:t>
+      </w:r>
+      <w:r>
+        <w:t xml:space="preserve">,</w:t>
+      </w:r>
+      <w:r>
+        <w:t xml:space="preserve"> </w:t>
+      </w:r>
+      <w:r>
+        <w:t xml:space="preserve">‘</w:t>
+      </w:r>
+      <w:r>
+        <w:t xml:space="preserve">arm9_confusion_replay</w:t>
+      </w:r>
+      <w:r>
+        <w:t xml:space="preserve">’</w:t>
+      </w:r>
+      <w:r>
+        <w:t xml:space="preserve">:</w:t>
+      </w:r>
+      <w:r>
+        <w:t xml:space="preserve"> </w:t>
+      </w:r>
+      <w:r>
+        <w:t xml:space="preserve">‘</w:t>
+      </w:r>
+      <w:r>
+        <w:t xml:space="preserve">DENY</w:t>
+      </w:r>
+      <w:r>
+        <w:t xml:space="preserve">’</w:t>
+      </w:r>
+      <w:r>
+        <w:t xml:space="preserve">,</w:t>
+      </w:r>
+      <w:r>
+        <w:t xml:space="preserve"> </w:t>
+      </w:r>
+      <w:r>
+        <w:t xml:space="preserve">‘</w:t>
+      </w:r>
+      <w:r>
+        <w:t xml:space="preserve">arm10_spam_idle</w:t>
+      </w:r>
+      <w:r>
+        <w:t xml:space="preserve">’</w:t>
+      </w:r>
+      <w:r>
+        <w:t xml:space="preserve">:</w:t>
+      </w:r>
+      <w:r>
+        <w:t xml:space="preserve"> </w:t>
+      </w:r>
+      <w:r>
+        <w:t xml:space="preserve">‘</w:t>
+      </w:r>
+      <w:r>
+        <w:t xml:space="preserve">SPAM</w:t>
+      </w:r>
+      <w:r>
+        <w:t xml:space="preserve">’</w:t>
+      </w:r>
+      <w:r>
+        <w:t xml:space="preserve">}</w:t>
+      </w:r>
+    </w:p>
+    <w:p>
+      <w:pPr>
+        <w:numPr>
+          <w:ilvl w:val="0"/>
+          <w:numId w:val="1005"/>
+        </w:numPr>
+      </w:pPr>
+      <w:r>
+        <w:rPr>
+          <w:bCs/>
+          <w:b/>
+        </w:rPr>
+        <w:t xml:space="preserve">Arm classes:</w:t>
+      </w:r>
+      <w:r>
+        <w:t xml:space="preserve"> </w:t>
+      </w:r>
+      <w:r>
+        <w:t xml:space="preserve">{</w:t>
+      </w:r>
+      <w:r>
+        <w:t xml:space="preserve">‘</w:t>
+      </w:r>
+      <w:r>
+        <w:t xml:space="preserve">arm1_allow_standard</w:t>
+      </w:r>
+      <w:r>
+        <w:t xml:space="preserve">’</w:t>
+      </w:r>
+      <w:r>
+        <w:t xml:space="preserve">:</w:t>
+      </w:r>
+      <w:r>
+        <w:t xml:space="preserve"> </w:t>
+      </w:r>
+      <w:r>
+        <w:t xml:space="preserve">‘</w:t>
+      </w:r>
+      <w:r>
+        <w:t xml:space="preserve">allow</w:t>
+      </w:r>
+      <w:r>
+        <w:t xml:space="preserve">’</w:t>
+      </w:r>
+      <w:r>
+        <w:t xml:space="preserve">,</w:t>
+      </w:r>
+      <w:r>
+        <w:t xml:space="preserve"> </w:t>
+      </w:r>
+      <w:r>
+        <w:t xml:space="preserve">‘</w:t>
+      </w:r>
+      <w:r>
+        <w:t xml:space="preserve">arm2_deny_standard</w:t>
+      </w:r>
+      <w:r>
+        <w:t xml:space="preserve">’</w:t>
+      </w:r>
+      <w:r>
+        <w:t xml:space="preserve">:</w:t>
+      </w:r>
+      <w:r>
+        <w:t xml:space="preserve"> </w:t>
+      </w:r>
+      <w:r>
+        <w:t xml:space="preserve">‘</w:t>
+      </w:r>
+      <w:r>
+        <w:t xml:space="preserve">deny</w:t>
+      </w:r>
+      <w:r>
+        <w:t xml:space="preserve">’</w:t>
+      </w:r>
+      <w:r>
+        <w:t xml:space="preserve">,</w:t>
+      </w:r>
+      <w:r>
+        <w:t xml:space="preserve"> </w:t>
+      </w:r>
+      <w:r>
+        <w:t xml:space="preserve">‘</w:t>
+      </w:r>
+      <w:r>
+        <w:t xml:space="preserve">arm3_hold_plus</w:t>
+      </w:r>
+      <w:r>
+        <w:t xml:space="preserve">’</w:t>
+      </w:r>
+      <w:r>
+        <w:t xml:space="preserve">:</w:t>
+      </w:r>
+      <w:r>
+        <w:t xml:space="preserve"> </w:t>
+      </w:r>
+      <w:r>
+        <w:t xml:space="preserve">‘</w:t>
+      </w:r>
+      <w:r>
+        <w:t xml:space="preserve">hold</w:t>
+      </w:r>
+      <w:r>
+        <w:t xml:space="preserve">’</w:t>
+      </w:r>
+      <w:r>
+        <w:t xml:space="preserve">,</w:t>
+      </w:r>
+      <w:r>
+        <w:t xml:space="preserve"> </w:t>
+      </w:r>
+      <w:r>
+        <w:t xml:space="preserve">‘</w:t>
+      </w:r>
+      <w:r>
+        <w:t xml:space="preserve">arm4_hold_minus</w:t>
+      </w:r>
+      <w:r>
+        <w:t xml:space="preserve">’</w:t>
+      </w:r>
+      <w:r>
+        <w:t xml:space="preserve">:</w:t>
+      </w:r>
+      <w:r>
+        <w:t xml:space="preserve"> </w:t>
+      </w:r>
+      <w:r>
+        <w:t xml:space="preserve">‘</w:t>
+      </w:r>
+      <w:r>
+        <w:t xml:space="preserve">hold</w:t>
+      </w:r>
+      <w:r>
+        <w:t xml:space="preserve">’</w:t>
+      </w:r>
+      <w:r>
+        <w:t xml:space="preserve">,</w:t>
+      </w:r>
+      <w:r>
+        <w:t xml:space="preserve"> </w:t>
+      </w:r>
+      <w:r>
+        <w:t xml:space="preserve">‘</w:t>
+      </w:r>
+      <w:r>
+        <w:t xml:space="preserve">arm5_allow_alt</w:t>
+      </w:r>
+      <w:r>
+        <w:t xml:space="preserve">’</w:t>
+      </w:r>
+      <w:r>
+        <w:t xml:space="preserve">:</w:t>
+      </w:r>
+      <w:r>
+        <w:t xml:space="preserve"> </w:t>
+      </w:r>
+      <w:r>
+        <w:t xml:space="preserve">‘</w:t>
+      </w:r>
+      <w:r>
+        <w:t xml:space="preserve">allow</w:t>
+      </w:r>
+      <w:r>
+        <w:t xml:space="preserve">’</w:t>
+      </w:r>
+      <w:r>
+        <w:t xml:space="preserve">,</w:t>
+      </w:r>
+      <w:r>
+        <w:t xml:space="preserve"> </w:t>
+      </w:r>
+      <w:r>
+        <w:t xml:space="preserve">‘</w:t>
+      </w:r>
+      <w:r>
+        <w:t xml:space="preserve">arm6_deny_alt</w:t>
+      </w:r>
+      <w:r>
+        <w:t xml:space="preserve">’</w:t>
+      </w:r>
+      <w:r>
+        <w:t xml:space="preserve">:</w:t>
+      </w:r>
+      <w:r>
+        <w:t xml:space="preserve"> </w:t>
+      </w:r>
+      <w:r>
+        <w:t xml:space="preserve">‘</w:t>
+      </w:r>
+      <w:r>
+        <w:t xml:space="preserve">deny</w:t>
+      </w:r>
+      <w:r>
+        <w:t xml:space="preserve">’</w:t>
+      </w:r>
+      <w:r>
+        <w:t xml:space="preserve">,</w:t>
+      </w:r>
+      <w:r>
+        <w:t xml:space="preserve"> </w:t>
+      </w:r>
+      <w:r>
+        <w:t xml:space="preserve">‘</w:t>
+      </w:r>
+      <w:r>
+        <w:t xml:space="preserve">arm7_allow_reverified</w:t>
+      </w:r>
+      <w:r>
+        <w:t xml:space="preserve">’</w:t>
+      </w:r>
+      <w:r>
+        <w:t xml:space="preserve">:</w:t>
+      </w:r>
+      <w:r>
+        <w:t xml:space="preserve"> </w:t>
+      </w:r>
+      <w:r>
+        <w:t xml:space="preserve">‘</w:t>
+      </w:r>
+      <w:r>
+        <w:t xml:space="preserve">allow</w:t>
+      </w:r>
+      <w:r>
+        <w:t xml:space="preserve">’</w:t>
+      </w:r>
+      <w:r>
+        <w:t xml:space="preserve">,</w:t>
+      </w:r>
+      <w:r>
+        <w:t xml:space="preserve"> </w:t>
+      </w:r>
+      <w:r>
+        <w:t xml:space="preserve">‘</w:t>
+      </w:r>
+      <w:r>
+        <w:t xml:space="preserve">arm8_deny_expired</w:t>
+      </w:r>
+      <w:r>
+        <w:t xml:space="preserve">’</w:t>
+      </w:r>
+      <w:r>
+        <w:t xml:space="preserve">:</w:t>
+      </w:r>
+      <w:r>
+        <w:t xml:space="preserve"> </w:t>
+      </w:r>
+      <w:r>
+        <w:t xml:space="preserve">‘</w:t>
+      </w:r>
+      <w:r>
+        <w:t xml:space="preserve">deny</w:t>
+      </w:r>
+      <w:r>
+        <w:t xml:space="preserve">’</w:t>
+      </w:r>
+      <w:r>
+        <w:t xml:space="preserve">,</w:t>
+      </w:r>
+      <w:r>
+        <w:t xml:space="preserve"> </w:t>
+      </w:r>
+      <w:r>
+        <w:t xml:space="preserve">‘</w:t>
+      </w:r>
+      <w:r>
+        <w:t xml:space="preserve">arm9_confusion_replay</w:t>
+      </w:r>
+      <w:r>
+        <w:t xml:space="preserve">’</w:t>
+      </w:r>
+      <w:r>
+        <w:t xml:space="preserve">:</w:t>
+      </w:r>
+      <w:r>
+        <w:t xml:space="preserve"> </w:t>
+      </w:r>
+      <w:r>
+        <w:t xml:space="preserve">‘</w:t>
+      </w:r>
+      <w:r>
+        <w:t xml:space="preserve">deny</w:t>
+      </w:r>
+      <w:r>
+        <w:t xml:space="preserve">’</w:t>
+      </w:r>
+      <w:r>
+        <w:t xml:space="preserve">,</w:t>
+      </w:r>
+      <w:r>
+        <w:t xml:space="preserve"> </w:t>
+      </w:r>
+      <w:r>
+        <w:t xml:space="preserve">‘</w:t>
+      </w:r>
+      <w:r>
+        <w:t xml:space="preserve">arm10_spam_idle</w:t>
+      </w:r>
+      <w:r>
+        <w:t xml:space="preserve">’</w:t>
+      </w:r>
+      <w:r>
+        <w:t xml:space="preserve">:</w:t>
+      </w:r>
+      <w:r>
+        <w:t xml:space="preserve"> </w:t>
+      </w:r>
+      <w:r>
+        <w:t xml:space="preserve">‘</w:t>
+      </w:r>
+      <w:r>
+        <w:t xml:space="preserve">idle_spam</w:t>
+      </w:r>
+      <w:r>
+        <w:t xml:space="preserve">’</w:t>
+      </w:r>
+      <w:r>
+        <w:t xml:space="preserve">}</w:t>
+      </w:r>
+    </w:p>
+    <w:p>
+      <w:pPr>
+        <w:numPr>
+          <w:ilvl w:val="0"/>
+          <w:numId w:val="1005"/>
+        </w:numPr>
+      </w:pPr>
+      <w:r>
+        <w:rPr>
+          <w:bCs/>
+          <w:b/>
+        </w:rPr>
+        <w:t xml:space="preserve">Optimization level:</w:t>
+      </w:r>
+      <w:r>
+        <w:t xml:space="preserve"> </w:t>
+      </w:r>
+      <w:r>
+        <w:t xml:space="preserve">3 (seed_transpiler=445, no dynamical decoupling)</w:t>
+      </w:r>
+    </w:p>
+    <w:p>
+      <w:pPr>
+        <w:numPr>
+          <w:ilvl w:val="0"/>
+          <w:numId w:val="1005"/>
+        </w:numPr>
+      </w:pPr>
+      <w:r>
+        <w:rPr>
+          <w:bCs/>
+          <w:b/>
+        </w:rPr>
+        <w:t xml:space="preserve">JOB ID:</w:t>
+      </w:r>
+      <w:r>
+        <w:t xml:space="preserve"> </w:t>
+      </w:r>
+      <w:r>
+        <w:rPr>
+          <w:rStyle w:val="VerbatimChar"/>
+        </w:rPr>
+        <w:t xml:space="preserve">d9codk9htsac739c1dug</w:t>
+      </w:r>
+    </w:p>
+    <w:p>
+      <w:pPr>
+        <w:numPr>
+          <w:ilvl w:val="0"/>
+          <w:numId w:val="1005"/>
+        </w:numPr>
+      </w:pPr>
+      <w:r>
+        <w:rPr>
+          <w:bCs/>
+          <w:b/>
+        </w:rPr>
+        <w:t xml:space="preserve">Submission timestamp (UTC):</w:t>
+      </w:r>
+      <w:r>
+        <w:t xml:space="preserve"> </w:t>
+      </w:r>
+      <w:r>
+        <w:t xml:space="preserve">2026-07-17T01:35:12.046870+00:00</w:t>
+      </w:r>
+    </w:p>
+    <w:p>
+      <w:pPr>
+        <w:numPr>
+          <w:ilvl w:val="0"/>
+          <w:numId w:val="1005"/>
+        </w:numPr>
+      </w:pPr>
+      <w:r>
+        <w:rPr>
+          <w:bCs/>
+          <w:b/>
+        </w:rPr>
+        <w:t xml:space="preserve">SPAM job id:</w:t>
+      </w:r>
+      <w:r>
+        <w:t xml:space="preserve"> </w:t>
+      </w:r>
+      <w:r>
+        <w:rPr>
+          <w:rStyle w:val="VerbatimChar"/>
+        </w:rPr>
+        <w:t xml:space="preserve">d9coda9htsac739c1djg</w:t>
+      </w:r>
+    </w:p>
+    <w:p>
+      <w:pPr>
+        <w:numPr>
+          <w:ilvl w:val="0"/>
+          <w:numId w:val="1005"/>
+        </w:numPr>
+      </w:pPr>
+      <w:r>
+        <w:rPr>
+          <w:bCs/>
+          <w:b/>
+        </w:rPr>
+        <w:t xml:space="preserve">SPAM baselines:</w:t>
+      </w:r>
+      <w:r>
+        <w:t xml:space="preserve"> </w:t>
+      </w:r>
+      <w:r>
+        <w:t xml:space="preserve">SPAM_A=0.0007, SPAM_P=0.0011, drift=0.0004</w:t>
+      </w:r>
+    </w:p>
+    <w:p>
+      <w:pPr>
+        <w:numPr>
+          <w:ilvl w:val="0"/>
+          <w:numId w:val="1005"/>
+        </w:numPr>
+      </w:pPr>
+      <w:r>
+        <w:rPr>
+          <w:bCs/>
+          <w:b/>
+        </w:rPr>
+        <w:t xml:space="preserve">Transpiled depths:</w:t>
+      </w:r>
+      <w:r>
+        <w:t xml:space="preserve"> </w:t>
+      </w:r>
+      <w:r>
+        <w:t xml:space="preserve">{</w:t>
+      </w:r>
+      <w:r>
+        <w:t xml:space="preserve">‘</w:t>
+      </w:r>
+      <w:r>
+        <w:t xml:space="preserve">arm1_allow_standard</w:t>
+      </w:r>
+      <w:r>
+        <w:t xml:space="preserve">’</w:t>
+      </w:r>
+      <w:r>
+        <w:t xml:space="preserve">: 4,</w:t>
+      </w:r>
+      <w:r>
+        <w:t xml:space="preserve"> </w:t>
+      </w:r>
+      <w:r>
+        <w:t xml:space="preserve">‘</w:t>
+      </w:r>
+      <w:r>
+        <w:t xml:space="preserve">arm2_deny_standard</w:t>
+      </w:r>
+      <w:r>
+        <w:t xml:space="preserve">’</w:t>
+      </w:r>
+      <w:r>
+        <w:t xml:space="preserve">: 3,</w:t>
+      </w:r>
+      <w:r>
+        <w:t xml:space="preserve"> </w:t>
+      </w:r>
+      <w:r>
+        <w:t xml:space="preserve">‘</w:t>
+      </w:r>
+      <w:r>
+        <w:t xml:space="preserve">arm3_hold_plus</w:t>
+      </w:r>
+      <w:r>
+        <w:t xml:space="preserve">’</w:t>
+      </w:r>
+      <w:r>
+        <w:t xml:space="preserve">: 6,</w:t>
+      </w:r>
+      <w:r>
+        <w:t xml:space="preserve"> </w:t>
+      </w:r>
+      <w:r>
+        <w:t xml:space="preserve">‘</w:t>
+      </w:r>
+      <w:r>
+        <w:t xml:space="preserve">arm4_hold_minus</w:t>
+      </w:r>
+      <w:r>
+        <w:t xml:space="preserve">’</w:t>
+      </w:r>
+      <w:r>
+        <w:t xml:space="preserve">: 6,</w:t>
+      </w:r>
+      <w:r>
+        <w:t xml:space="preserve"> </w:t>
+      </w:r>
+      <w:r>
+        <w:t xml:space="preserve">‘</w:t>
+      </w:r>
+      <w:r>
+        <w:t xml:space="preserve">arm5_allow_alt</w:t>
+      </w:r>
+      <w:r>
+        <w:t xml:space="preserve">’</w:t>
+      </w:r>
+      <w:r>
+        <w:t xml:space="preserve">: 4,</w:t>
+      </w:r>
+      <w:r>
+        <w:t xml:space="preserve"> </w:t>
+      </w:r>
+      <w:r>
+        <w:t xml:space="preserve">‘</w:t>
+      </w:r>
+      <w:r>
+        <w:t xml:space="preserve">arm6_deny_alt</w:t>
+      </w:r>
+      <w:r>
+        <w:t xml:space="preserve">’</w:t>
+      </w:r>
+      <w:r>
+        <w:t xml:space="preserve">: 3,</w:t>
+      </w:r>
+      <w:r>
+        <w:t xml:space="preserve"> </w:t>
+      </w:r>
+      <w:r>
+        <w:t xml:space="preserve">‘</w:t>
+      </w:r>
+      <w:r>
+        <w:t xml:space="preserve">arm7_allow_reverified</w:t>
+      </w:r>
+      <w:r>
+        <w:t xml:space="preserve">’</w:t>
+      </w:r>
+      <w:r>
+        <w:t xml:space="preserve">: 5,</w:t>
+      </w:r>
+      <w:r>
+        <w:t xml:space="preserve"> </w:t>
+      </w:r>
+      <w:r>
+        <w:t xml:space="preserve">‘</w:t>
+      </w:r>
+      <w:r>
+        <w:t xml:space="preserve">arm8_deny_expired</w:t>
+      </w:r>
+      <w:r>
+        <w:t xml:space="preserve">’</w:t>
+      </w:r>
+      <w:r>
+        <w:t xml:space="preserve">: 4,</w:t>
+      </w:r>
+      <w:r>
+        <w:t xml:space="preserve"> </w:t>
+      </w:r>
+      <w:r>
+        <w:t xml:space="preserve">‘</w:t>
+      </w:r>
+      <w:r>
+        <w:t xml:space="preserve">arm9_confusion_replay</w:t>
+      </w:r>
+      <w:r>
+        <w:t xml:space="preserve">’</w:t>
+      </w:r>
+      <w:r>
+        <w:t xml:space="preserve">: 6}</w:t>
+      </w:r>
+    </w:p>
+    <w:p>
+      <w:pPr>
+        <w:numPr>
+          <w:ilvl w:val="0"/>
+          <w:numId w:val="1005"/>
+        </w:numPr>
+      </w:pPr>
+      <w:r>
+        <w:rPr>
+          <w:bCs/>
+          <w:b/>
+        </w:rPr>
+        <w:t xml:space="preserve">Job-ID committed BEFORE result retrieval (Field 27 step 7).</w:t>
+      </w:r>
+    </w:p>
+    <w:bookmarkEnd w:id="23"/>
+    <w:bookmarkStart w:id="24" w:name="step-8-11-retrieval-analysis-results"/>
+    <w:p>
+      <w:pPr>
+        <w:pStyle w:val="Heading2"/>
+      </w:pPr>
+      <w:r>
+        <w:t xml:space="preserve">Step 8-11 — Retrieval / analysis / results</w:t>
+      </w:r>
+    </w:p>
+    <w:p>
+      <w:pPr>
+        <w:numPr>
+          <w:ilvl w:val="0"/>
+          <w:numId w:val="1006"/>
+        </w:numPr>
         <w:pStyle w:val="Compact"/>
       </w:pPr>
       <w:r>
         <w:rPr>
-          <w:iCs/>
-          <w:i/>
-        </w:rPr>
-        <w:t xml:space="preserve">(pending)</w:t>
-      </w:r>
-    </w:p>
-    <w:bookmarkEnd w:id="23"/>
+          <w:bCs/>
+          <w:b/>
+        </w:rPr>
+        <w:t xml:space="preserve">Step 8 (retrieval):</w:t>
+      </w:r>
+      <w:r>
+        <w:t xml:space="preserve"> </w:t>
+      </w:r>
+      <w:r>
+        <w:t xml:space="preserve">Principal job</w:t>
+      </w:r>
+      <w:r>
+        <w:t xml:space="preserve"> </w:t>
+      </w:r>
+      <w:r>
+        <w:rPr>
+          <w:rStyle w:val="VerbatimChar"/>
+        </w:rPr>
+        <w:t xml:space="preserve">d9codk9htsac739c1dug</w:t>
+      </w:r>
+      <w:r>
+        <w:t xml:space="preserve"> </w:t>
+      </w:r>
+      <w:r>
+        <w:t xml:space="preserve">completed with status DONE. Raw per-arm counts (9 arms × 8192 shots) retrieved and committed to</w:t>
+      </w:r>
+      <w:r>
+        <w:t xml:space="preserve"> </w:t>
+      </w:r>
+      <w:r>
+        <w:rPr>
+          <w:rStyle w:val="VerbatimChar"/>
+        </w:rPr>
+        <w:t xml:space="preserve">raw_results.json</w:t>
+      </w:r>
+      <w:r>
+        <w:t xml:space="preserve"> </w:t>
+      </w:r>
+      <w:r>
+        <w:t xml:space="preserve">before analysis.</w:t>
+      </w:r>
+    </w:p>
+    <w:p>
+      <w:pPr>
+        <w:numPr>
+          <w:ilvl w:val="0"/>
+          <w:numId w:val="1006"/>
+        </w:numPr>
+        <w:pStyle w:val="Compact"/>
+      </w:pPr>
+      <w:r>
+        <w:rPr>
+          <w:bCs/>
+          <w:b/>
+        </w:rPr>
+        <w:t xml:space="preserve">Step 9 (analysis):</w:t>
+      </w:r>
+      <w:r>
+        <w:t xml:space="preserve"> </w:t>
+      </w:r>
+      <w:r>
+        <w:t xml:space="preserve">SPAM-corrected discrimination computed per arm. Results:</w:t>
+      </w:r>
+    </w:p>
+    <w:p>
+      <w:pPr>
+        <w:numPr>
+          <w:ilvl w:val="1"/>
+          <w:numId w:val="1007"/>
+        </w:numPr>
+        <w:pStyle w:val="Compact"/>
+      </w:pPr>
+      <w:r>
+        <w:t xml:space="preserve">ALLOW arms: arm1=0.9805, arm5=0.9771, arm7=0.9626 →</w:t>
+      </w:r>
+      <w:r>
+        <w:t xml:space="preserve"> </w:t>
+      </w:r>
+      <w:r>
+        <w:rPr>
+          <w:bCs/>
+          <w:b/>
+        </w:rPr>
+        <w:t xml:space="preserve">S_A_min=0.9626</w:t>
+      </w:r>
+      <w:r>
+        <w:t xml:space="preserve"> </w:t>
+      </w:r>
+      <w:r>
+        <w:t xml:space="preserve">(criterion ≥0.90 ✅)</w:t>
+      </w:r>
+    </w:p>
+    <w:p>
+      <w:pPr>
+        <w:numPr>
+          <w:ilvl w:val="1"/>
+          <w:numId w:val="1007"/>
+        </w:numPr>
+        <w:pStyle w:val="Compact"/>
+      </w:pPr>
+      <w:r>
+        <w:t xml:space="preserve">HOLD arms: arm3(|+⟩)=0.4946, arm4(|−⟩)=0.4918 → both ∈ [0.40,0.60] ✅; I_H=0.0028 symmetric ✅</w:t>
+      </w:r>
+    </w:p>
+    <w:p>
+      <w:pPr>
+        <w:numPr>
+          <w:ilvl w:val="1"/>
+          <w:numId w:val="1007"/>
+        </w:numPr>
+        <w:pStyle w:val="Compact"/>
+      </w:pPr>
+      <w:r>
+        <w:t xml:space="preserve">DENY arms: arm2=0.0029, arm6=0.0018, arm8=0.0011 (all corrected, ≤0.02 ✅)</w:t>
+      </w:r>
+    </w:p>
+    <w:p>
+      <w:pPr>
+        <w:numPr>
+          <w:ilvl w:val="1"/>
+          <w:numId w:val="1007"/>
+        </w:numPr>
+        <w:pStyle w:val="Compact"/>
+      </w:pPr>
+      <w:r>
+        <w:rPr>
+          <w:bCs/>
+          <w:b/>
+        </w:rPr>
+        <w:t xml:space="preserve">arm9 confusion/replay (mid-circuit reset+re-prepare): L_conf_corrected=0.0289 &gt; 0.02 DENY ceiling ❌</w:t>
+      </w:r>
+    </w:p>
+    <w:p>
+      <w:pPr>
+        <w:numPr>
+          <w:ilvl w:val="1"/>
+          <w:numId w:val="1007"/>
+        </w:numPr>
+        <w:pStyle w:val="Compact"/>
+      </w:pPr>
+      <w:r>
+        <w:t xml:space="preserve">Δ_H (ALLOW−HOLD separation) = 0.4629 (criterion ≥0.30 ✅)</w:t>
+      </w:r>
+    </w:p>
+    <w:p>
+      <w:pPr>
+        <w:numPr>
+          <w:ilvl w:val="1"/>
+          <w:numId w:val="1007"/>
+        </w:numPr>
+        <w:pStyle w:val="Compact"/>
+      </w:pPr>
+      <w:r>
+        <w:t xml:space="preserve">SPAM gate: SPAM_A=0.0007, SPAM_P=0.0011, drift=0.0004 — all PASS</w:t>
+      </w:r>
+    </w:p>
+    <w:p>
+      <w:pPr>
+        <w:numPr>
+          <w:ilvl w:val="0"/>
+          <w:numId w:val="1006"/>
+        </w:numPr>
+        <w:pStyle w:val="Compact"/>
+      </w:pPr>
+      <w:r>
+        <w:rPr>
+          <w:bCs/>
+          <w:b/>
+        </w:rPr>
+        <w:t xml:space="preserve">Step 10 (verdict):</w:t>
+      </w:r>
+      <w:r>
+        <w:t xml:space="preserve"> </w:t>
+      </w:r>
+      <w:r>
+        <w:rPr>
+          <w:bCs/>
+          <w:b/>
+        </w:rPr>
+        <w:t xml:space="preserve">VERDICT = FAIL.</w:t>
+      </w:r>
+      <w:r>
+        <w:t xml:space="preserve"> </w:t>
+      </w:r>
+      <w:r>
+        <w:t xml:space="preserve">4 of 5 quantitative criteria met. Single failing criterion: arm9 reset-based confusion/replay leaked 0.0289 (&gt; 0.02), consistent with mid-circuit reset infidelity on the principal qubit. Core tri-state discrimination (ALLOW/HOLD/DENY) is strong (Δ_H=0.463).</w:t>
+      </w:r>
+      <w:r>
+        <w:t xml:space="preserve"> </w:t>
+      </w:r>
+      <w:r>
+        <w:rPr>
+          <w:bCs/>
+          <w:b/>
+        </w:rPr>
+        <w:t xml:space="preserve">No post-data rescue applied — honest FAIL reported per protocol.</w:t>
+      </w:r>
+    </w:p>
+    <w:p>
+      <w:pPr>
+        <w:numPr>
+          <w:ilvl w:val="0"/>
+          <w:numId w:val="1006"/>
+        </w:numPr>
+        <w:pStyle w:val="Compact"/>
+      </w:pPr>
+      <w:r>
+        <w:rPr>
+          <w:bCs/>
+          <w:b/>
+        </w:rPr>
+        <w:t xml:space="preserve">Step 11 (results):</w:t>
+      </w:r>
+      <w:r>
+        <w:t xml:space="preserve"> </w:t>
+      </w:r>
+      <w:r>
+        <w:rPr>
+          <w:rStyle w:val="VerbatimChar"/>
+        </w:rPr>
+        <w:t xml:space="preserve">proofrecord.json</w:t>
+      </w:r>
+      <w:r>
+        <w:t xml:space="preserve">,</w:t>
+      </w:r>
+      <w:r>
+        <w:t xml:space="preserve"> </w:t>
+      </w:r>
+      <w:r>
+        <w:rPr>
+          <w:rStyle w:val="VerbatimChar"/>
+        </w:rPr>
+        <w:t xml:space="preserve">plots/arm_results.png</w:t>
+      </w:r>
+      <w:r>
+        <w:t xml:space="preserve">,</w:t>
+      </w:r>
+      <w:r>
+        <w:t xml:space="preserve"> </w:t>
+      </w:r>
+      <w:r>
+        <w:rPr>
+          <w:rStyle w:val="VerbatimChar"/>
+        </w:rPr>
+        <w:t xml:space="preserve">plots/tristate_discrimination.png</w:t>
+      </w:r>
+      <w:r>
+        <w:t xml:space="preserve">, and</w:t>
+      </w:r>
+      <w:r>
+        <w:t xml:space="preserve"> </w:t>
+      </w:r>
+      <w:r>
+        <w:rPr>
+          <w:rStyle w:val="VerbatimChar"/>
+        </w:rPr>
+        <w:t xml:space="preserve">RESULTS.md</w:t>
+      </w:r>
+      <w:r>
+        <w:t xml:space="preserve"> </w:t>
+      </w:r>
+      <w:r>
+        <w:t xml:space="preserve">(+ .docx/.pdf) generated and committed.</w:t>
+      </w:r>
+    </w:p>
     <w:bookmarkEnd w:id="24"/>
+    <w:bookmarkEnd w:id="25"/>
     <w:sectPr/>
   </w:body>
 </w:document>
@@ -521,6 +1973,12 @@
     <w:abstractNumId w:val="991"/>
   </w:num>
   <w:num w:numId="1005">
+    <w:abstractNumId w:val="991"/>
+  </w:num>
+  <w:num w:numId="1006">
+    <w:abstractNumId w:val="991"/>
+  </w:num>
+  <w:num w:numId="1007">
     <w:abstractNumId w:val="991"/>
   </w:num>
 </w:numbering>

</xml_diff>